<commit_message>
feat: update LKPD Jangka Sorong PDF and DOCX documents with latest revisions
</commit_message>
<xml_diff>
--- a/KELAS 7/bab1/Jangka sorong/LKPD JANGKA SORONG.docx
+++ b/KELAS 7/bab1/Jangka sorong/LKPD JANGKA SORONG.docx
@@ -68,21 +68,22 @@
       </w:r>
     </w:p>
     <w:p>
+      <w:bookmarkStart w:id="0" w:name="_GoBack"/>
       <w:r>
         <w:rPr>
           <w:noProof/>
         </w:rPr>
         <w:lastRenderedPageBreak/>
         <w:drawing>
-          <wp:anchor distT="0" distB="0" distL="114300" distR="114300" simplePos="0" relativeHeight="251659264" behindDoc="0" locked="0" layoutInCell="1" allowOverlap="1" wp14:anchorId="3C5F0FEA" wp14:editId="453C1DE4">
+          <wp:anchor distT="0" distB="0" distL="114300" distR="114300" simplePos="0" relativeHeight="251659264" behindDoc="0" locked="0" layoutInCell="1" allowOverlap="1" wp14:anchorId="3C5F0FEA" wp14:editId="2A9048FE">
             <wp:simplePos x="0" y="0"/>
             <wp:positionH relativeFrom="column">
-              <wp:posOffset>-866775</wp:posOffset>
+              <wp:posOffset>-857250</wp:posOffset>
             </wp:positionH>
             <wp:positionV relativeFrom="paragraph">
               <wp:posOffset>-866775</wp:posOffset>
             </wp:positionV>
-            <wp:extent cx="7658100" cy="9867900"/>
+            <wp:extent cx="7591425" cy="9870758"/>
             <wp:effectExtent l="0" t="0" r="0" b="0"/>
             <wp:wrapNone/>
             <wp:docPr id="2" name="Picture 2"/>
@@ -111,7 +112,7 @@
                   <pic:spPr>
                     <a:xfrm>
                       <a:off x="0" y="0"/>
-                      <a:ext cx="7661011" cy="9871651"/>
+                      <a:ext cx="7596759" cy="9877693"/>
                     </a:xfrm>
                     <a:prstGeom prst="rect">
                       <a:avLst/>
@@ -129,6 +130,7 @@
           </wp:anchor>
         </w:drawing>
       </w:r>
+      <w:bookmarkEnd w:id="0"/>
     </w:p>
     <w:p/>
     <w:p/>
@@ -177,7 +179,6 @@
           <w:tab w:val="left" w:pos="4035"/>
         </w:tabs>
       </w:pPr>
-      <w:bookmarkStart w:id="0" w:name="_GoBack"/>
       <w:r>
         <w:rPr>
           <w:noProof/>
@@ -207,7 +208,7 @@
                     <pic:cNvPicPr/>
                   </pic:nvPicPr>
                   <pic:blipFill>
-                    <a:blip r:embed="rId5">
+                    <a:blip r:embed="rId6">
                       <a:extLst>
                         <a:ext uri="{28A0092B-C50C-407E-A947-70E740481C1C}">
                           <a14:useLocalDpi xmlns:a14="http://schemas.microsoft.com/office/drawing/2010/main" val="0"/>
@@ -239,7 +240,6 @@
           </wp:anchor>
         </w:drawing>
       </w:r>
-      <w:bookmarkEnd w:id="0"/>
     </w:p>
     <w:sectPr>
       <w:pgSz w:w="12240" w:h="15840"/>

</xml_diff>